<commit_message>
Updated filename.ext with new changes
</commit_message>
<xml_diff>
--- a/DOCUMENTATION.docx
+++ b/DOCUMENTATION.docx
@@ -41,13 +41,13 @@
           <w:noProof/>
         </w:rPr>
         <w:drawing>
-          <wp:anchor distT="0" distB="0" distL="114300" distR="114300" simplePos="0" relativeHeight="251658240" behindDoc="0" locked="0" layoutInCell="1" allowOverlap="1" wp14:anchorId="578B7455" wp14:editId="2B1C987C">
+          <wp:anchor distT="0" distB="0" distL="114300" distR="114300" simplePos="0" relativeHeight="251658240" behindDoc="0" locked="0" layoutInCell="1" allowOverlap="1" wp14:anchorId="578B7455" wp14:editId="5E90CC1F">
             <wp:simplePos x="0" y="0"/>
             <wp:positionH relativeFrom="column">
-              <wp:posOffset>-332280</wp:posOffset>
+              <wp:posOffset>-190215</wp:posOffset>
             </wp:positionH>
             <wp:positionV relativeFrom="page">
-              <wp:posOffset>755760</wp:posOffset>
+              <wp:posOffset>755650</wp:posOffset>
             </wp:positionV>
             <wp:extent cx="1450340" cy="1052195"/>
             <wp:effectExtent l="0" t="0" r="0" b="0"/>

</xml_diff>